<commit_message>
Add English and Arabic research instruments; tick Arabic boxes in Form 6
- New: 06 English and 07 Arabic research instruments (interview guides
  for women and for nurses/physiotherapists, demographic forms, and
  field-note template).
- Form 6: tick the Arabic half of each bilingual option (consent
  document, guardian consent, personal data, attachments, declarations).
- Protocol and Form 6 now point to the English and Arabic instruments.

Claude-Session: https://claude.ai/code/session_01Bi7sWUTrQGwtHL6n9ZVRo3
</commit_message>
<xml_diff>
--- a/ethics_submission/01_Research_Proposal_Form_6_Jouf_University.docx
+++ b/ethics_submission/01_Research_Proposal_Form_6_Jouf_University.docx
@@ -4823,7 +4823,7 @@
           <w:sz w:val="22"/>
           <w:szCs w:val="22"/>
         </w:rPr>
-        <w:t xml:space="preserve">A brief demographic form will be completed at each interview, and field notes will be written within 24 hours. Interview guides will be piloted with one woman and one nurse, whose data will be excluded, and reviewed by three maternity clinicians outside the sample. Full interview guides are provided in Appendices A and B of Form 1.</w:t>
+        <w:t xml:space="preserve">A brief demographic form will be completed at each interview, and field notes will be written within 24 hours. Interview guides will be piloted with one woman and one nurse, whose data will be excluded, and reviewed by three maternity clinicians outside the sample. Full interview guides, in English and Arabic, are provided in Appendices A and B of Form 1 and in Documents 06 and 07.</w:t>
       </w:r>
     </w:p>
     <w:p>
@@ -6363,7 +6363,7 @@
                 <w:rtl w:val="true"/>
               </w:rPr>
               <w:tab/>
-              <w:t>□</w:t>
+              <w:t>☒</w:t>
             </w:r>
             <w:r>
               <w:rPr>
@@ -6866,7 +6866,7 @@
                 <w:szCs w:val="24"/>
                 <w:rtl w:val="true"/>
               </w:rPr>
-              <w:t>□</w:t>
+              <w:t>☒</w:t>
             </w:r>
             <w:r>
               <w:rPr>
@@ -7152,7 +7152,7 @@
                 <w:szCs w:val="24"/>
                 <w:rtl w:val="true"/>
               </w:rPr>
-              <w:t>□</w:t>
+              <w:t>☒</w:t>
             </w:r>
             <w:r>
               <w:rPr>
@@ -7378,7 +7378,7 @@
                 <w:szCs w:val="24"/>
                 <w:rtl w:val="true"/>
               </w:rPr>
-              <w:t>□</w:t>
+              <w:t>☒</w:t>
             </w:r>
             <w:r>
               <w:rPr>
@@ -7462,7 +7462,7 @@
                 <w:szCs w:val="24"/>
                 <w:rtl w:val="true"/>
               </w:rPr>
-              <w:t>□</w:t>
+              <w:t>☒</w:t>
             </w:r>
             <w:r>
               <w:rPr>
@@ -7775,7 +7775,7 @@
                 <w:szCs w:val="24"/>
                 <w:rtl w:val="true"/>
               </w:rPr>
-              <w:t>□</w:t>
+              <w:t>☒</w:t>
             </w:r>
             <w:r>
               <w:rPr>
@@ -8578,7 +8578,7 @@
                 <w:rtl w:val="true"/>
                 <w:lang w:val="en-GB"/>
               </w:rPr>
-              <w:t xml:space="preserve">□ </w:t>
+              <w:t xml:space="preserve">☒ </w:t>
             </w:r>
             <w:r>
               <w:rPr>
@@ -9359,7 +9359,7 @@
                 <w:szCs w:val="24"/>
                 <w:rtl w:val="true"/>
               </w:rPr>
-              <w:t>□</w:t>
+              <w:t>☒</w:t>
             </w:r>
             <w:r>
               <w:rPr>
@@ -9563,7 +9563,7 @@
                 <w:szCs w:val="24"/>
                 <w:rtl w:val="true"/>
               </w:rPr>
-              <w:t>□</w:t>
+              <w:t>☒</w:t>
             </w:r>
             <w:r>
               <w:rPr>
@@ -9627,7 +9627,7 @@
                 <w:szCs w:val="24"/>
                 <w:rtl w:val="true"/>
               </w:rPr>
-              <w:t xml:space="preserve">                                                                                                                        □</w:t>
+              <w:t xml:space="preserve">                                                                                                                        ☒</w:t>
             </w:r>
             <w:r>
               <w:rPr>
@@ -9746,7 +9746,7 @@
                 <w:szCs w:val="24"/>
                 <w:rtl w:val="true"/>
               </w:rPr>
-              <w:t>□</w:t>
+              <w:t>☒</w:t>
             </w:r>
             <w:r>
               <w:rPr>
@@ -9857,7 +9857,7 @@
                 <w:szCs w:val="24"/>
                 <w:rtl w:val="true"/>
               </w:rPr>
-              <w:t>□</w:t>
+              <w:t>☒</w:t>
             </w:r>
             <w:r>
               <w:rPr>
@@ -9957,7 +9957,7 @@
                 <w:szCs w:val="24"/>
                 <w:rtl w:val="true"/>
               </w:rPr>
-              <w:t>□</w:t>
+              <w:t>☒</w:t>
             </w:r>
             <w:r>
               <w:rPr>
@@ -10411,7 +10411,7 @@
                 <w:szCs w:val="24"/>
                 <w:rtl w:val="true"/>
               </w:rPr>
-              <w:t>□</w:t>
+              <w:t>☒</w:t>
             </w:r>
             <w:r>
               <w:rPr>
@@ -10579,7 +10579,7 @@
                 <w:szCs w:val="24"/>
                 <w:rtl w:val="true"/>
               </w:rPr>
-              <w:t>□</w:t>
+              <w:t>☒</w:t>
             </w:r>
             <w:r>
               <w:rPr>
@@ -10860,7 +10860,7 @@
                 <w:szCs w:val="24"/>
                 <w:rtl w:val="true"/>
               </w:rPr>
-              <w:t>□</w:t>
+              <w:t>☒</w:t>
             </w:r>
             <w:r>
               <w:rPr>
@@ -11212,7 +11212,7 @@
                 <w:szCs w:val="24"/>
                 <w:rtl w:val="true"/>
               </w:rPr>
-              <w:t>□</w:t>
+              <w:t>☒</w:t>
             </w:r>
             <w:r>
               <w:rPr>
@@ -11386,7 +11386,7 @@
                 <w:szCs w:val="24"/>
                 <w:rtl w:val="true"/>
               </w:rPr>
-              <w:t>□</w:t>
+              <w:t>☒</w:t>
             </w:r>
             <w:r>
               <w:rPr>
@@ -11766,7 +11766,7 @@
                 <w:szCs w:val="24"/>
                 <w:rtl w:val="true"/>
               </w:rPr>
-              <w:t>□</w:t>
+              <w:t>☒</w:t>
             </w:r>
             <w:r>
               <w:rPr>
@@ -12012,7 +12012,7 @@
                 <w:szCs w:val="24"/>
                 <w:rtl w:val="true"/>
               </w:rPr>
-              <w:t>□</w:t>
+              <w:t>☒</w:t>
             </w:r>
             <w:r>
               <w:rPr>
@@ -12262,7 +12262,7 @@
                 <w:szCs w:val="24"/>
                 <w:rtl w:val="true"/>
               </w:rPr>
-              <w:t>□</w:t>
+              <w:t>☒</w:t>
             </w:r>
             <w:r>
               <w:rPr>

</xml_diff>